<commit_message>
KureaSH ℞+ nasal insufflation
</commit_message>
<xml_diff>
--- a/KureaSH_internasal_administration.docx
+++ b/KureaSH_internasal_administration.docx
@@ -3480,21 +3480,19 @@
         <w:rPr>
           <w:rFonts w:ascii="Inter" w:hAnsi="Inter"/>
         </w:rPr>
-        <w:t xml:space="preserve"> While commercial dry powder delivery devices like the </w:t>
-      </w:r>
-      <w:proofErr w:type="spellStart"/>
-      <w:r>
-        <w:rPr>
-          <w:rFonts w:ascii="Inter" w:hAnsi="Inter"/>
-        </w:rPr>
-        <w:t>DriDose</w:t>
-      </w:r>
-      <w:proofErr w:type="spellEnd"/>
-      <w:r>
-        <w:rPr>
-          <w:rFonts w:ascii="Inter" w:hAnsi="Inter"/>
-        </w:rPr>
-        <w:t xml:space="preserve">® Unit Dose system are typically pre-filled by the pharmaceutical manufacturer on a mass scale, UW pharmacology technicians manually fill and assemble each single-use, unit-dose applicator in-house specifically for this experimental trial. </w:t>
+        <w:t xml:space="preserve"> </w:t>
+      </w:r>
+      <w:r>
+        <w:rPr>
+          <w:rFonts w:ascii="Inter" w:hAnsi="Inter"/>
+        </w:rPr>
+        <w:t>C</w:t>
+      </w:r>
+      <w:r>
+        <w:rPr>
+          <w:rFonts w:ascii="Inter" w:hAnsi="Inter"/>
+        </w:rPr>
+        <w:t xml:space="preserve">ommercial dry powder delivery devices are typically pre-filled by the pharmaceutical manufacturer on a mass scale, UW pharmacology technicians manually fill and assemble each single-use, unit-dose applicator in-house specifically for this experimental trial. </w:t>
       </w:r>
     </w:p>
     <w:p>
@@ -3672,19 +3670,17 @@
         </w:rPr>
         <w:t xml:space="preserve"> Following fulfillment, assembly, and technician verification, the completed </w:t>
       </w:r>
-      <w:proofErr w:type="spellStart"/>
-      <w:r>
-        <w:rPr>
-          <w:rFonts w:ascii="Inter" w:hAnsi="Inter"/>
-        </w:rPr>
-        <w:t>DriDose</w:t>
-      </w:r>
-      <w:proofErr w:type="spellEnd"/>
-      <w:r>
-        <w:rPr>
-          <w:rFonts w:ascii="Inter" w:hAnsi="Inter"/>
-        </w:rPr>
-        <w:t xml:space="preserve">® Unit Dose device is delivered to the clinical area. The patient is instructed to sit completely upright or stand tall to maximize lung expansion and optimize pathway clearance right before administration. </w:t>
+      <w:r>
+        <w:rPr>
+          <w:rFonts w:ascii="Inter" w:hAnsi="Inter"/>
+        </w:rPr>
+        <w:t>nasal insufflation</w:t>
+      </w:r>
+      <w:r>
+        <w:rPr>
+          <w:rFonts w:ascii="Inter" w:hAnsi="Inter"/>
+        </w:rPr>
+        <w:t xml:space="preserve"> device is delivered to the clinical area. The patient is instructed to sit completely upright or stand tall to maximize lung expansion and optimize pathway clearance right before administration. </w:t>
       </w:r>
     </w:p>
     <w:p>

</xml_diff>